<commit_message>
alteração de ajustes nos testes
</commit_message>
<xml_diff>
--- a/docs/US001 - Adicionar item ao carrinho.docx
+++ b/docs/US001 - Adicionar item ao carrinho.docx
@@ -861,8 +861,8 @@
         <w:tblLook w:val="04A0" w:firstRow="1" w:lastRow="0" w:firstColumn="1" w:lastColumn="0" w:noHBand="0" w:noVBand="1"/>
       </w:tblPr>
       <w:tblGrid>
-        <w:gridCol w:w="888"/>
-        <w:gridCol w:w="7600"/>
+        <w:gridCol w:w="802"/>
+        <w:gridCol w:w="7686"/>
       </w:tblGrid>
       <w:tr>
         <w:tc>
@@ -932,13 +932,12 @@
             <w:r>
               <w:rPr>
                 <w:rFonts w:eastAsia="Times New Roman"/>
-                <w:noProof/>
               </w:rPr>
               <w:drawing>
-                <wp:inline distT="0" distB="0" distL="0" distR="0" wp14:anchorId="79E7D570" wp14:editId="51CC6CB5">
-                  <wp:extent cx="4787153" cy="3462017"/>
-                  <wp:effectExtent l="0" t="0" r="1270" b="5715"/>
-                  <wp:docPr id="3" name="Imagem 3" descr="Interface gráfica do usuário, Aplicativo, Teams&#10;&#10;Descrição gerada automaticamente"/>
+                <wp:inline distT="0" distB="0" distL="0" distR="0" wp14:anchorId="505746C6" wp14:editId="3F42F98A">
+                  <wp:extent cx="5400040" cy="2661285"/>
+                  <wp:effectExtent l="0" t="0" r="0" b="5715"/>
+                  <wp:docPr id="394650533" name="Imagem 1"/>
                   <wp:cNvGraphicFramePr>
                     <a:graphicFrameLocks xmlns:a="http://schemas.openxmlformats.org/drawingml/2006/main" noChangeAspect="1"/>
                   </wp:cNvGraphicFramePr>
@@ -946,17 +945,11 @@
                     <a:graphicData uri="http://schemas.openxmlformats.org/drawingml/2006/picture">
                       <pic:pic xmlns:pic="http://schemas.openxmlformats.org/drawingml/2006/picture">
                         <pic:nvPicPr>
-                          <pic:cNvPr id="3" name="Imagem 3" descr="Interface gráfica do usuário, Aplicativo, Teams&#10;&#10;Descrição gerada automaticamente"/>
+                          <pic:cNvPr id="394650533" name=""/>
                           <pic:cNvPicPr/>
                         </pic:nvPicPr>
                         <pic:blipFill>
-                          <a:blip r:embed="rId6" cstate="print">
-                            <a:extLst>
-                              <a:ext uri="{28A0092B-C50C-407E-A947-70E740481C1C}">
-                                <a14:useLocalDpi xmlns:a14="http://schemas.microsoft.com/office/drawing/2010/main" val="0"/>
-                              </a:ext>
-                            </a:extLst>
-                          </a:blip>
+                          <a:blip r:embed="rId6"/>
                           <a:stretch>
                             <a:fillRect/>
                           </a:stretch>
@@ -964,7 +957,7 @@
                         <pic:spPr>
                           <a:xfrm>
                             <a:off x="0" y="0"/>
-                            <a:ext cx="4806930" cy="3476320"/>
+                            <a:ext cx="5400040" cy="2661285"/>
                           </a:xfrm>
                           <a:prstGeom prst="rect">
                             <a:avLst/>
@@ -1288,7 +1281,6 @@
               <w:rPr>
                 <w:rFonts w:eastAsia="Times New Roman"/>
               </w:rPr>
-              <w:lastRenderedPageBreak/>
               <w:t xml:space="preserve"> Cenários de testes  </w:t>
             </w:r>
           </w:p>
@@ -1594,6 +1586,7 @@
               <w:rPr>
                 <w:rFonts w:eastAsia="Times New Roman"/>
               </w:rPr>
+              <w:lastRenderedPageBreak/>
               <w:t>CT03</w:t>
             </w:r>
           </w:p>
@@ -2800,7 +2793,6 @@
         <w:rPr>
           <w:rFonts w:eastAsia="Times New Roman"/>
         </w:rPr>
-        <w:lastRenderedPageBreak/>
         <w:t>Particionamento de Equivalência:</w:t>
       </w:r>
     </w:p>
@@ -2832,6 +2824,7 @@
         <w:rPr>
           <w:rFonts w:eastAsia="Times New Roman"/>
         </w:rPr>
+        <w:lastRenderedPageBreak/>
         <w:t xml:space="preserve">RN01: </w:t>
       </w:r>
       <w:r>
@@ -5862,6 +5855,7 @@
                 <w:sz w:val="22"/>
                 <w:szCs w:val="22"/>
               </w:rPr>
+              <w:lastRenderedPageBreak/>
               <w:t xml:space="preserve">&lt;R$ </w:t>
             </w:r>
             <w:r>

</xml_diff>